<commit_message>
Commit antes de preproducción
</commit_message>
<xml_diff>
--- a/documentación/Casos de Uso/0.0 CU Portal.docx
+++ b/documentación/Casos de Uso/0.0 CU Portal.docx
@@ -936,7 +936,7 @@
     <w:p>
       <w:pPr>
         <w:numPr>
-          <w:ilvl w:val="1"/>
+          <w:ilvl w:val="0"/>
           <w:numId w:val="4"/>
         </w:numPr>
         <w:jc w:val="both"/>
@@ -950,7 +950,23 @@
           <w:rFonts w:ascii="Arial" w:eastAsia="Arial" w:hAnsi="Arial" w:cs="Arial"/>
           <w:lang w:val="es-GT"/>
         </w:rPr>
-        <w:t>Estado de cuenta.</w:t>
+        <w:t xml:space="preserve">El usuario navega por las opciones de su expediente. </w:t>
+      </w:r>
+      <w:r>
+        <w:rPr>
+          <w:rFonts w:ascii="Arial" w:eastAsia="Arial" w:hAnsi="Arial" w:cs="Arial"/>
+          <w:b/>
+          <w:bCs/>
+          <w:lang w:val="es-GT"/>
+        </w:rPr>
+        <w:t>(FA02)</w:t>
+      </w:r>
+      <w:r>
+        <w:rPr>
+          <w:rFonts w:ascii="Arial" w:eastAsia="Arial" w:hAnsi="Arial" w:cs="Arial"/>
+          <w:lang w:val="es-GT"/>
+        </w:rPr>
+        <w:t>.</w:t>
       </w:r>
     </w:p>
     <w:p>
@@ -970,23 +986,7 @@
           <w:rFonts w:ascii="Arial" w:eastAsia="Arial" w:hAnsi="Arial" w:cs="Arial"/>
           <w:lang w:val="es-GT"/>
         </w:rPr>
-        <w:t xml:space="preserve">El usuario navega por las opciones de su expediente. </w:t>
-      </w:r>
-      <w:r>
-        <w:rPr>
-          <w:rFonts w:ascii="Arial" w:eastAsia="Arial" w:hAnsi="Arial" w:cs="Arial"/>
-          <w:b/>
-          <w:bCs/>
-          <w:lang w:val="es-GT"/>
-        </w:rPr>
-        <w:t>(FA02)</w:t>
-      </w:r>
-      <w:r>
-        <w:rPr>
-          <w:rFonts w:ascii="Arial" w:eastAsia="Arial" w:hAnsi="Arial" w:cs="Arial"/>
-          <w:lang w:val="es-GT"/>
-        </w:rPr>
-        <w:t>.</w:t>
+        <w:t>El usuario finaliza su actividad y cierra la sesión de forma segura.</w:t>
       </w:r>
     </w:p>
     <w:p>
@@ -1006,26 +1006,6 @@
           <w:rFonts w:ascii="Arial" w:eastAsia="Arial" w:hAnsi="Arial" w:cs="Arial"/>
           <w:lang w:val="es-GT"/>
         </w:rPr>
-        <w:t>El usuario finaliza su actividad y cierra la sesión de forma segura.</w:t>
-      </w:r>
-    </w:p>
-    <w:p>
-      <w:pPr>
-        <w:numPr>
-          <w:ilvl w:val="0"/>
-          <w:numId w:val="4"/>
-        </w:numPr>
-        <w:jc w:val="both"/>
-        <w:rPr>
-          <w:rFonts w:ascii="Arial" w:eastAsia="Arial" w:hAnsi="Arial" w:cs="Arial"/>
-          <w:lang w:val="es-GT"/>
-        </w:rPr>
-      </w:pPr>
-      <w:r>
-        <w:rPr>
-          <w:rFonts w:ascii="Arial" w:eastAsia="Arial" w:hAnsi="Arial" w:cs="Arial"/>
-          <w:lang w:val="es-GT"/>
-        </w:rPr>
         <w:t>Fin del caso de uso.</w:t>
       </w:r>
     </w:p>
@@ -1086,7 +1066,6 @@
           <w:bCs/>
           <w:lang w:val="es-GT"/>
         </w:rPr>
-        <w:lastRenderedPageBreak/>
         <w:t>FA01: Credenciales de Acceso Incorrectas</w:t>
       </w:r>
       <w:r>
@@ -1114,6 +1093,7 @@
           <w:rFonts w:ascii="Arial" w:eastAsia="Arial" w:hAnsi="Arial" w:cs="Arial"/>
           <w:lang w:val="es-GT"/>
         </w:rPr>
+        <w:lastRenderedPageBreak/>
         <w:t xml:space="preserve">El sistema detecta que los datos no coinciden con el registro. </w:t>
       </w:r>
     </w:p>

</xml_diff>